<commit_message>
Update 3. Comparación Con Plataformas Similares.docx
</commit_message>
<xml_diff>
--- a/Documentos/Fase 1/3. Comparación Con Plataformas Similares.docx
+++ b/Documentos/Fase 1/3. Comparación Con Plataformas Similares.docx
@@ -1150,7 +1150,26 @@
           <w:rFonts w:ascii="Calibri" w:cs="Calibri" w:eastAsia="Calibri" w:hAnsi="Calibri"/>
           <w:rtl w:val="0"/>
         </w:rPr>
-        <w:t xml:space="preserve">Plataforma chilena que digitalizará trámites notariales, con firma electrónica y certificación notarial. Ofrece integración por API, pagos y facturación automáticos.</w:t>
+        <w:t xml:space="preserve">Plataforma chilena que </w:t>
+      </w:r>
+      <w:r>
+        <w:rPr>
+          <w:rtl w:val="0"/>
+        </w:rPr>
+        <w:t xml:space="preserve">digitaliza</w:t>
+      </w:r>
+      <w:r>
+        <w:rPr>
+          <w:rtl w:val="0"/>
+        </w:rPr>
+        <w:t xml:space="preserve"> </w:t>
+      </w:r>
+      <w:r>
+        <w:rPr>
+          <w:rFonts w:ascii="Calibri" w:cs="Calibri" w:eastAsia="Calibri" w:hAnsi="Calibri"/>
+          <w:rtl w:val="0"/>
+        </w:rPr>
+        <w:t xml:space="preserve">trámites notariales, con firma electrónica y certificación notarial. Ofrece integración por API, pagos y facturación automáticos.</w:t>
       </w:r>
     </w:p>
     <w:p>
@@ -1370,12 +1389,14 @@
           <w:p>
             <w:pPr>
               <w:rPr>
-                <w:rFonts w:ascii="Calibri" w:cs="Calibri" w:eastAsia="Calibri" w:hAnsi="Calibri"/>
-              </w:rPr>
-            </w:pPr>
-            <w:r>
-              <w:rPr>
-                <w:rFonts w:ascii="Calibri" w:cs="Calibri" w:eastAsia="Calibri" w:hAnsi="Calibri"/>
+                <w:b w:val="1"/>
+                <w:bCs w:val="1"/>
+              </w:rPr>
+            </w:pPr>
+            <w:r>
+              <w:rPr>
+                <w:b w:val="1"/>
+                <w:bCs w:val="1"/>
                 <w:rtl w:val="0"/>
               </w:rPr>
               <w:t xml:space="preserve">Etapa</w:t>
@@ -1401,12 +1422,14 @@
           <w:p>
             <w:pPr>
               <w:rPr>
-                <w:rFonts w:ascii="Calibri" w:cs="Calibri" w:eastAsia="Calibri" w:hAnsi="Calibri"/>
-              </w:rPr>
-            </w:pPr>
-            <w:r>
-              <w:rPr>
-                <w:rFonts w:ascii="Calibri" w:cs="Calibri" w:eastAsia="Calibri" w:hAnsi="Calibri"/>
+                <w:b w:val="1"/>
+                <w:bCs w:val="1"/>
+              </w:rPr>
+            </w:pPr>
+            <w:r>
+              <w:rPr>
+                <w:b w:val="1"/>
+                <w:bCs w:val="1"/>
                 <w:rtl w:val="0"/>
               </w:rPr>
               <w:t xml:space="preserve">Easy Office</w:t>
@@ -1432,19 +1455,22 @@
           <w:p>
             <w:pPr>
               <w:rPr>
-                <w:rFonts w:ascii="Calibri" w:cs="Calibri" w:eastAsia="Calibri" w:hAnsi="Calibri"/>
-              </w:rPr>
-            </w:pPr>
-            <w:r>
-              <w:rPr>
-                <w:rFonts w:ascii="Calibri" w:cs="Calibri" w:eastAsia="Calibri" w:hAnsi="Calibri"/>
+                <w:b w:val="1"/>
+                <w:bCs w:val="1"/>
+              </w:rPr>
+            </w:pPr>
+            <w:r>
+              <w:rPr>
+                <w:b w:val="1"/>
+                <w:bCs w:val="1"/>
                 <w:rtl w:val="0"/>
               </w:rPr>
               <w:t xml:space="preserve">FirmaVirtual</w:t>
             </w:r>
             <w:r>
               <w:rPr>
-                <w:rFonts w:ascii="Calibri" w:cs="Calibri" w:eastAsia="Calibri" w:hAnsi="Calibri"/>
+                <w:b w:val="1"/>
+                <w:bCs w:val="1"/>
                 <w:rtl w:val="0"/>
               </w:rPr>
               <w:t xml:space="preserve"> (Chile)</w:t>
@@ -1470,12 +1496,14 @@
           <w:p>
             <w:pPr>
               <w:rPr>
-                <w:rFonts w:ascii="Calibri" w:cs="Calibri" w:eastAsia="Calibri" w:hAnsi="Calibri"/>
-              </w:rPr>
-            </w:pPr>
-            <w:r>
-              <w:rPr>
-                <w:rFonts w:ascii="Calibri" w:cs="Calibri" w:eastAsia="Calibri" w:hAnsi="Calibri"/>
+                <w:b w:val="1"/>
+                <w:bCs w:val="1"/>
+              </w:rPr>
+            </w:pPr>
+            <w:r>
+              <w:rPr>
+                <w:b w:val="1"/>
+                <w:bCs w:val="1"/>
                 <w:rtl w:val="0"/>
               </w:rPr>
               <w:t xml:space="preserve">Notaría 16 Bogotá</w:t>
@@ -1484,12 +1512,14 @@
           <w:p>
             <w:pPr>
               <w:rPr>
-                <w:rFonts w:ascii="Calibri" w:cs="Calibri" w:eastAsia="Calibri" w:hAnsi="Calibri"/>
-              </w:rPr>
-            </w:pPr>
-            <w:r>
-              <w:rPr>
-                <w:rFonts w:ascii="Calibri" w:cs="Calibri" w:eastAsia="Calibri" w:hAnsi="Calibri"/>
+                <w:b w:val="1"/>
+                <w:bCs w:val="1"/>
+              </w:rPr>
+            </w:pPr>
+            <w:r>
+              <w:rPr>
+                <w:b w:val="1"/>
+                <w:bCs w:val="1"/>
                 <w:rtl w:val="0"/>
               </w:rPr>
               <w:t xml:space="preserve">(Colombia)</w:t>
@@ -1515,19 +1545,22 @@
           <w:p>
             <w:pPr>
               <w:rPr>
-                <w:rFonts w:ascii="Calibri" w:cs="Calibri" w:eastAsia="Calibri" w:hAnsi="Calibri"/>
-              </w:rPr>
-            </w:pPr>
-            <w:r>
-              <w:rPr>
-                <w:rFonts w:ascii="Calibri" w:cs="Calibri" w:eastAsia="Calibri" w:hAnsi="Calibri"/>
+                <w:b w:val="1"/>
+                <w:bCs w:val="1"/>
+              </w:rPr>
+            </w:pPr>
+            <w:r>
+              <w:rPr>
+                <w:b w:val="1"/>
+                <w:bCs w:val="1"/>
                 <w:rtl w:val="0"/>
               </w:rPr>
               <w:t xml:space="preserve">Proof</w:t>
             </w:r>
             <w:r>
               <w:rPr>
-                <w:rFonts w:ascii="Calibri" w:cs="Calibri" w:eastAsia="Calibri" w:hAnsi="Calibri"/>
+                <w:b w:val="1"/>
+                <w:bCs w:val="1"/>
                 <w:rtl w:val="0"/>
               </w:rPr>
               <w:t xml:space="preserve"> (EE.UU.)</w:t>
@@ -1553,12 +1586,14 @@
           <w:p>
             <w:pPr>
               <w:rPr>
-                <w:rFonts w:ascii="Calibri" w:cs="Calibri" w:eastAsia="Calibri" w:hAnsi="Calibri"/>
-              </w:rPr>
-            </w:pPr>
-            <w:r>
-              <w:rPr>
-                <w:rFonts w:ascii="Calibri" w:cs="Calibri" w:eastAsia="Calibri" w:hAnsi="Calibri"/>
+                <w:b w:val="1"/>
+                <w:bCs w:val="1"/>
+              </w:rPr>
+            </w:pPr>
+            <w:r>
+              <w:rPr>
+                <w:b w:val="1"/>
+                <w:bCs w:val="1"/>
                 <w:rtl w:val="0"/>
               </w:rPr>
               <w:t xml:space="preserve">e-Notariado (Brasil)</w:t>
@@ -1591,12 +1626,14 @@
           <w:p>
             <w:pPr>
               <w:rPr>
-                <w:rFonts w:ascii="Calibri" w:cs="Calibri" w:eastAsia="Calibri" w:hAnsi="Calibri"/>
-              </w:rPr>
-            </w:pPr>
-            <w:r>
-              <w:rPr>
-                <w:rFonts w:ascii="Calibri" w:cs="Calibri" w:eastAsia="Calibri" w:hAnsi="Calibri"/>
+                <w:b w:val="1"/>
+                <w:bCs w:val="1"/>
+              </w:rPr>
+            </w:pPr>
+            <w:r>
+              <w:rPr>
+                <w:b w:val="1"/>
+                <w:bCs w:val="1"/>
                 <w:rtl w:val="0"/>
               </w:rPr>
               <w:t xml:space="preserve">Identidad</w:t>
@@ -1784,12 +1821,14 @@
           <w:p>
             <w:pPr>
               <w:rPr>
-                <w:rFonts w:ascii="Calibri" w:cs="Calibri" w:eastAsia="Calibri" w:hAnsi="Calibri"/>
-              </w:rPr>
-            </w:pPr>
-            <w:r>
-              <w:rPr>
-                <w:rFonts w:ascii="Calibri" w:cs="Calibri" w:eastAsia="Calibri" w:hAnsi="Calibri"/>
+                <w:b w:val="1"/>
+                <w:bCs w:val="1"/>
+              </w:rPr>
+            </w:pPr>
+            <w:r>
+              <w:rPr>
+                <w:b w:val="1"/>
+                <w:bCs w:val="1"/>
                 <w:rtl w:val="0"/>
               </w:rPr>
               <w:t xml:space="preserve">Datos</w:t>
@@ -1977,12 +2016,14 @@
           <w:p>
             <w:pPr>
               <w:rPr>
-                <w:rFonts w:ascii="Calibri" w:cs="Calibri" w:eastAsia="Calibri" w:hAnsi="Calibri"/>
-              </w:rPr>
-            </w:pPr>
-            <w:r>
-              <w:rPr>
-                <w:rFonts w:ascii="Calibri" w:cs="Calibri" w:eastAsia="Calibri" w:hAnsi="Calibri"/>
+                <w:b w:val="1"/>
+                <w:bCs w:val="1"/>
+              </w:rPr>
+            </w:pPr>
+            <w:r>
+              <w:rPr>
+                <w:b w:val="1"/>
+                <w:bCs w:val="1"/>
                 <w:rtl w:val="0"/>
               </w:rPr>
               <w:t xml:space="preserve">Pago</w:t>
@@ -2170,12 +2211,14 @@
           <w:p>
             <w:pPr>
               <w:rPr>
-                <w:rFonts w:ascii="Calibri" w:cs="Calibri" w:eastAsia="Calibri" w:hAnsi="Calibri"/>
-              </w:rPr>
-            </w:pPr>
-            <w:r>
-              <w:rPr>
-                <w:rFonts w:ascii="Calibri" w:cs="Calibri" w:eastAsia="Calibri" w:hAnsi="Calibri"/>
+                <w:b w:val="1"/>
+                <w:bCs w:val="1"/>
+              </w:rPr>
+            </w:pPr>
+            <w:r>
+              <w:rPr>
+                <w:b w:val="1"/>
+                <w:bCs w:val="1"/>
                 <w:rtl w:val="0"/>
               </w:rPr>
               <w:t xml:space="preserve">Documento</w:t>
@@ -2363,12 +2406,14 @@
           <w:p>
             <w:pPr>
               <w:rPr>
-                <w:rFonts w:ascii="Calibri" w:cs="Calibri" w:eastAsia="Calibri" w:hAnsi="Calibri"/>
-              </w:rPr>
-            </w:pPr>
-            <w:r>
-              <w:rPr>
-                <w:rFonts w:ascii="Calibri" w:cs="Calibri" w:eastAsia="Calibri" w:hAnsi="Calibri"/>
+                <w:b w:val="1"/>
+                <w:bCs w:val="1"/>
+              </w:rPr>
+            </w:pPr>
+            <w:r>
+              <w:rPr>
+                <w:b w:val="1"/>
+                <w:bCs w:val="1"/>
                 <w:rtl w:val="0"/>
               </w:rPr>
               <w:t xml:space="preserve">Revisión o notario</w:t>
@@ -2556,12 +2601,14 @@
           <w:p>
             <w:pPr>
               <w:rPr>
-                <w:rFonts w:ascii="Calibri" w:cs="Calibri" w:eastAsia="Calibri" w:hAnsi="Calibri"/>
-              </w:rPr>
-            </w:pPr>
-            <w:r>
-              <w:rPr>
-                <w:rFonts w:ascii="Calibri" w:cs="Calibri" w:eastAsia="Calibri" w:hAnsi="Calibri"/>
+                <w:b w:val="1"/>
+                <w:bCs w:val="1"/>
+              </w:rPr>
+            </w:pPr>
+            <w:r>
+              <w:rPr>
+                <w:b w:val="1"/>
+                <w:bCs w:val="1"/>
                 <w:rtl w:val="0"/>
               </w:rPr>
               <w:t xml:space="preserve">Firma</w:t>
@@ -2749,12 +2796,14 @@
           <w:p>
             <w:pPr>
               <w:rPr>
-                <w:rFonts w:ascii="Calibri" w:cs="Calibri" w:eastAsia="Calibri" w:hAnsi="Calibri"/>
-              </w:rPr>
-            </w:pPr>
-            <w:r>
-              <w:rPr>
-                <w:rFonts w:ascii="Calibri" w:cs="Calibri" w:eastAsia="Calibri" w:hAnsi="Calibri"/>
+                <w:b w:val="1"/>
+                <w:bCs w:val="1"/>
+              </w:rPr>
+            </w:pPr>
+            <w:r>
+              <w:rPr>
+                <w:b w:val="1"/>
+                <w:bCs w:val="1"/>
                 <w:rtl w:val="0"/>
               </w:rPr>
               <w:t xml:space="preserve">Registro del acto</w:t>
@@ -2942,12 +2991,14 @@
           <w:p>
             <w:pPr>
               <w:rPr>
-                <w:rFonts w:ascii="Calibri" w:cs="Calibri" w:eastAsia="Calibri" w:hAnsi="Calibri"/>
-              </w:rPr>
-            </w:pPr>
-            <w:r>
-              <w:rPr>
-                <w:rFonts w:ascii="Calibri" w:cs="Calibri" w:eastAsia="Calibri" w:hAnsi="Calibri"/>
+                <w:b w:val="1"/>
+                <w:bCs w:val="1"/>
+              </w:rPr>
+            </w:pPr>
+            <w:r>
+              <w:rPr>
+                <w:b w:val="1"/>
+                <w:bCs w:val="1"/>
                 <w:rtl w:val="0"/>
               </w:rPr>
               <w:t xml:space="preserve">Entrega</w:t>
@@ -3135,12 +3186,14 @@
           <w:p>
             <w:pPr>
               <w:rPr>
-                <w:rFonts w:ascii="Calibri" w:cs="Calibri" w:eastAsia="Calibri" w:hAnsi="Calibri"/>
-              </w:rPr>
-            </w:pPr>
-            <w:r>
-              <w:rPr>
-                <w:rFonts w:ascii="Calibri" w:cs="Calibri" w:eastAsia="Calibri" w:hAnsi="Calibri"/>
+                <w:b w:val="1"/>
+                <w:bCs w:val="1"/>
+              </w:rPr>
+            </w:pPr>
+            <w:r>
+              <w:rPr>
+                <w:b w:val="1"/>
+                <w:bCs w:val="1"/>
                 <w:rtl w:val="0"/>
               </w:rPr>
               <w:t xml:space="preserve">Seguimiento y renovaciones</w:t>
@@ -3304,20 +3357,6 @@
         </w:tc>
       </w:tr>
     </w:tbl>
-    <w:p>
-      <w:pPr>
-        <w:pStyle w:val="Heading2"/>
-        <w:rPr/>
-      </w:pPr>
-      <w:bookmarkStart w:colFirst="0" w:colLast="0" w:name="_r8e968qtyt71" w:id="8"/>
-      <w:bookmarkEnd w:id="8"/>
-      <w:r>
-        <w:rPr>
-          <w:rtl w:val="0"/>
-        </w:rPr>
-        <w:t xml:space="preserve">Qué tienen en común</w:t>
-      </w:r>
-    </w:p>
     <w:p>
       <w:pPr>
         <w:numPr>
@@ -3386,13 +3425,18 @@
         <w:pStyle w:val="Heading2"/>
         <w:rPr/>
       </w:pPr>
-      <w:bookmarkStart w:colFirst="0" w:colLast="0" w:name="_wyldh9okbq60" w:id="9"/>
-      <w:bookmarkEnd w:id="9"/>
+      <w:bookmarkStart w:colFirst="0" w:colLast="0" w:name="_ois5yyepi5jz" w:id="8"/>
+      <w:bookmarkEnd w:id="8"/>
       <w:r>
         <w:rPr>
           <w:rtl w:val="0"/>
         </w:rPr>
-        <w:t xml:space="preserve">Una diferencia importante</w:t>
+        <w:t xml:space="preserve">Qué tienen en común</w:t>
+      </w:r>
+      <w:r>
+        <w:rPr>
+          <w:rtl w:val="0"/>
+        </w:rPr>
       </w:r>
     </w:p>
     <w:p>
@@ -3470,12 +3514,1011 @@
         </w:rPr>
         <w:t xml:space="preserve">Hay una persona responsable en el paso que da validez legal.</w:t>
       </w:r>
+    </w:p>
+    <w:p>
+      <w:pPr>
+        <w:pStyle w:val="Heading2"/>
+        <w:rPr/>
+      </w:pPr>
+      <w:bookmarkStart w:colFirst="0" w:colLast="0" w:name="_48iac0z2p2yh" w:id="9"/>
+      <w:bookmarkEnd w:id="9"/>
       <w:r>
         <w:rPr>
           <w:rtl w:val="0"/>
         </w:rPr>
+        <w:t xml:space="preserve">Comparación a profundidad pasarela de pago</w:t>
       </w:r>
     </w:p>
+    <w:p>
+      <w:pPr>
+        <w:rPr/>
+      </w:pPr>
+      <w:r>
+        <w:rPr>
+          <w:rtl w:val="0"/>
+        </w:rPr>
+      </w:r>
+    </w:p>
+    <w:tbl>
+      <w:tblPr>
+        <w:tblStyle w:val="Table3"/>
+        <w:tblW w:w="9025.511811023624" w:type="dxa"/>
+        <w:jc w:val="left"/>
+        <w:tblBorders>
+          <w:top w:color="000000" w:space="0" w:sz="0" w:val="nil"/>
+          <w:left w:color="000000" w:space="0" w:sz="0" w:val="nil"/>
+          <w:bottom w:color="000000" w:space="0" w:sz="0" w:val="nil"/>
+          <w:right w:color="000000" w:space="0" w:sz="0" w:val="nil"/>
+          <w:insideH w:color="000000" w:space="0" w:sz="0" w:val="nil"/>
+          <w:insideV w:color="000000" w:space="0" w:sz="0" w:val="nil"/>
+        </w:tblBorders>
+        <w:tblLayout w:type="fixed"/>
+        <w:tblLook w:val="0600"/>
+      </w:tblPr>
+      <w:tblGrid>
+        <w:gridCol w:w="1433.354847037563"/>
+        <w:gridCol w:w="1696.9071898799539"/>
+        <w:gridCol w:w="1613.6801342455146"/>
+        <w:gridCol w:w="2071.42894023493"/>
+        <w:gridCol w:w="2210.140699625662"/>
+        <w:tblGridChange w:id="0">
+          <w:tblGrid>
+            <w:gridCol w:w="1433.354847037563"/>
+            <w:gridCol w:w="1696.9071898799539"/>
+            <w:gridCol w:w="1613.6801342455146"/>
+            <w:gridCol w:w="2071.42894023493"/>
+            <w:gridCol w:w="2210.140699625662"/>
+          </w:tblGrid>
+        </w:tblGridChange>
+      </w:tblGrid>
+      <w:tr>
+        <w:trPr>
+          <w:cantSplit w:val="0"/>
+          <w:trHeight w:val="785" w:hRule="atLeast"/>
+          <w:tblHeader w:val="0"/>
+        </w:trPr>
+        <w:tc>
+          <w:tcPr>
+            <w:tcBorders>
+              <w:top w:color="000000" w:space="0" w:sz="8" w:val="single"/>
+              <w:left w:color="000000" w:space="0" w:sz="8" w:val="single"/>
+              <w:bottom w:color="000000" w:space="0" w:sz="8" w:val="single"/>
+              <w:right w:color="000000" w:space="0" w:sz="8" w:val="single"/>
+            </w:tcBorders>
+            <w:tcMar>
+              <w:top w:w="100.0" w:type="dxa"/>
+              <w:left w:w="100.0" w:type="dxa"/>
+              <w:bottom w:w="100.0" w:type="dxa"/>
+              <w:right w:w="100.0" w:type="dxa"/>
+            </w:tcMar>
+            <w:vAlign w:val="top"/>
+          </w:tcPr>
+          <w:p>
+            <w:pPr>
+              <w:jc w:val="center"/>
+              <w:rPr>
+                <w:b w:val="1"/>
+                <w:bCs w:val="1"/>
+              </w:rPr>
+            </w:pPr>
+            <w:r>
+              <w:rPr>
+                <w:b w:val="1"/>
+                <w:bCs w:val="1"/>
+                <w:rtl w:val="0"/>
+              </w:rPr>
+              <w:t xml:space="preserve">Notaria</w:t>
+            </w:r>
+          </w:p>
+        </w:tc>
+        <w:tc>
+          <w:tcPr>
+            <w:tcBorders>
+              <w:top w:color="000000" w:space="0" w:sz="8" w:val="single"/>
+              <w:left w:color="000000" w:space="0" w:sz="8" w:val="single"/>
+              <w:bottom w:color="000000" w:space="0" w:sz="8" w:val="single"/>
+              <w:right w:color="000000" w:space="0" w:sz="8" w:val="single"/>
+            </w:tcBorders>
+            <w:tcMar>
+              <w:top w:w="100.0" w:type="dxa"/>
+              <w:left w:w="100.0" w:type="dxa"/>
+              <w:bottom w:w="100.0" w:type="dxa"/>
+              <w:right w:w="100.0" w:type="dxa"/>
+            </w:tcMar>
+            <w:vAlign w:val="top"/>
+          </w:tcPr>
+          <w:p>
+            <w:pPr>
+              <w:jc w:val="center"/>
+              <w:rPr/>
+            </w:pPr>
+            <w:r>
+              <w:rPr>
+                <w:b w:val="1"/>
+                <w:bCs w:val="1"/>
+                <w:rtl w:val="0"/>
+              </w:rPr>
+              <w:t xml:space="preserve">Cuándo se paga</w:t>
+            </w:r>
+            <w:r>
+              <w:rPr>
+                <w:rtl w:val="0"/>
+              </w:rPr>
+            </w:r>
+          </w:p>
+        </w:tc>
+        <w:tc>
+          <w:tcPr>
+            <w:tcBorders>
+              <w:top w:color="000000" w:space="0" w:sz="8" w:val="single"/>
+              <w:left w:color="000000" w:space="0" w:sz="8" w:val="single"/>
+              <w:bottom w:color="000000" w:space="0" w:sz="8" w:val="single"/>
+              <w:right w:color="000000" w:space="0" w:sz="8" w:val="single"/>
+            </w:tcBorders>
+            <w:tcMar>
+              <w:top w:w="100.0" w:type="dxa"/>
+              <w:left w:w="100.0" w:type="dxa"/>
+              <w:bottom w:w="100.0" w:type="dxa"/>
+              <w:right w:w="100.0" w:type="dxa"/>
+            </w:tcMar>
+            <w:vAlign w:val="top"/>
+          </w:tcPr>
+          <w:p>
+            <w:pPr>
+              <w:jc w:val="center"/>
+              <w:rPr/>
+            </w:pPr>
+            <w:r>
+              <w:rPr>
+                <w:b w:val="1"/>
+                <w:bCs w:val="1"/>
+                <w:rtl w:val="0"/>
+              </w:rPr>
+              <w:t xml:space="preserve">Quién paga</w:t>
+            </w:r>
+            <w:r>
+              <w:rPr>
+                <w:rtl w:val="0"/>
+              </w:rPr>
+            </w:r>
+          </w:p>
+        </w:tc>
+        <w:tc>
+          <w:tcPr>
+            <w:tcBorders>
+              <w:top w:color="000000" w:space="0" w:sz="8" w:val="single"/>
+              <w:left w:color="000000" w:space="0" w:sz="8" w:val="single"/>
+              <w:bottom w:color="000000" w:space="0" w:sz="8" w:val="single"/>
+              <w:right w:color="000000" w:space="0" w:sz="8" w:val="single"/>
+            </w:tcBorders>
+            <w:tcMar>
+              <w:top w:w="100.0" w:type="dxa"/>
+              <w:left w:w="100.0" w:type="dxa"/>
+              <w:bottom w:w="100.0" w:type="dxa"/>
+              <w:right w:w="100.0" w:type="dxa"/>
+            </w:tcMar>
+            <w:vAlign w:val="top"/>
+          </w:tcPr>
+          <w:p>
+            <w:pPr>
+              <w:jc w:val="center"/>
+              <w:rPr/>
+            </w:pPr>
+            <w:r>
+              <w:rPr>
+                <w:b w:val="1"/>
+                <w:bCs w:val="1"/>
+                <w:rtl w:val="0"/>
+              </w:rPr>
+              <w:t xml:space="preserve">Medios y modelo</w:t>
+            </w:r>
+            <w:r>
+              <w:rPr>
+                <w:rtl w:val="0"/>
+              </w:rPr>
+            </w:r>
+          </w:p>
+        </w:tc>
+        <w:tc>
+          <w:tcPr>
+            <w:tcBorders>
+              <w:top w:color="000000" w:space="0" w:sz="8" w:val="single"/>
+              <w:left w:color="000000" w:space="0" w:sz="8" w:val="single"/>
+              <w:bottom w:color="000000" w:space="0" w:sz="8" w:val="single"/>
+              <w:right w:color="000000" w:space="0" w:sz="8" w:val="single"/>
+            </w:tcBorders>
+            <w:tcMar>
+              <w:top w:w="100.0" w:type="dxa"/>
+              <w:left w:w="100.0" w:type="dxa"/>
+              <w:bottom w:w="100.0" w:type="dxa"/>
+              <w:right w:w="100.0" w:type="dxa"/>
+            </w:tcMar>
+            <w:vAlign w:val="top"/>
+          </w:tcPr>
+          <w:p>
+            <w:pPr>
+              <w:jc w:val="center"/>
+              <w:rPr/>
+            </w:pPr>
+            <w:r>
+              <w:rPr>
+                <w:b w:val="1"/>
+                <w:bCs w:val="1"/>
+                <w:rtl w:val="0"/>
+              </w:rPr>
+              <w:t xml:space="preserve">Qué se libera al pagar</w:t>
+            </w:r>
+            <w:r>
+              <w:rPr>
+                <w:rtl w:val="0"/>
+              </w:rPr>
+            </w:r>
+          </w:p>
+        </w:tc>
+      </w:tr>
+      <w:tr>
+        <w:trPr>
+          <w:cantSplit w:val="0"/>
+          <w:trHeight w:val="2435" w:hRule="atLeast"/>
+          <w:tblHeader w:val="0"/>
+        </w:trPr>
+        <w:tc>
+          <w:tcPr>
+            <w:tcBorders>
+              <w:top w:color="000000" w:space="0" w:sz="8" w:val="single"/>
+              <w:left w:color="000000" w:space="0" w:sz="8" w:val="single"/>
+              <w:bottom w:color="000000" w:space="0" w:sz="8" w:val="single"/>
+              <w:right w:color="000000" w:space="0" w:sz="8" w:val="single"/>
+            </w:tcBorders>
+            <w:tcMar>
+              <w:top w:w="100.0" w:type="dxa"/>
+              <w:left w:w="100.0" w:type="dxa"/>
+              <w:bottom w:w="100.0" w:type="dxa"/>
+              <w:right w:w="100.0" w:type="dxa"/>
+            </w:tcMar>
+            <w:vAlign w:val="top"/>
+          </w:tcPr>
+          <w:p>
+            <w:pPr>
+              <w:rPr/>
+            </w:pPr>
+            <w:r>
+              <w:rPr>
+                <w:b w:val="1"/>
+                <w:bCs w:val="1"/>
+                <w:rtl w:val="0"/>
+              </w:rPr>
+              <w:t xml:space="preserve">Easy Office (propuesta)</w:t>
+            </w:r>
+            <w:r>
+              <w:rPr>
+                <w:rtl w:val="0"/>
+              </w:rPr>
+            </w:r>
+          </w:p>
+        </w:tc>
+        <w:tc>
+          <w:tcPr>
+            <w:tcBorders>
+              <w:top w:color="000000" w:space="0" w:sz="8" w:val="single"/>
+              <w:left w:color="000000" w:space="0" w:sz="8" w:val="single"/>
+              <w:bottom w:color="000000" w:space="0" w:sz="8" w:val="single"/>
+              <w:right w:color="000000" w:space="0" w:sz="8" w:val="single"/>
+            </w:tcBorders>
+            <w:tcMar>
+              <w:top w:w="100.0" w:type="dxa"/>
+              <w:left w:w="100.0" w:type="dxa"/>
+              <w:bottom w:w="100.0" w:type="dxa"/>
+              <w:right w:w="100.0" w:type="dxa"/>
+            </w:tcMar>
+            <w:vAlign w:val="top"/>
+          </w:tcPr>
+          <w:p>
+            <w:pPr>
+              <w:rPr/>
+            </w:pPr>
+            <w:r>
+              <w:rPr>
+                <w:rtl w:val="0"/>
+              </w:rPr>
+              <w:t xml:space="preserve">Antes de generar el documento. En el 50/50, el segundo abono se cobra después</w:t>
+            </w:r>
+          </w:p>
+        </w:tc>
+        <w:tc>
+          <w:tcPr>
+            <w:tcBorders>
+              <w:top w:color="000000" w:space="0" w:sz="8" w:val="single"/>
+              <w:left w:color="000000" w:space="0" w:sz="8" w:val="single"/>
+              <w:bottom w:color="000000" w:space="0" w:sz="8" w:val="single"/>
+              <w:right w:color="000000" w:space="0" w:sz="8" w:val="single"/>
+            </w:tcBorders>
+            <w:tcMar>
+              <w:top w:w="100.0" w:type="dxa"/>
+              <w:left w:w="100.0" w:type="dxa"/>
+              <w:bottom w:w="100.0" w:type="dxa"/>
+              <w:right w:w="100.0" w:type="dxa"/>
+            </w:tcMar>
+            <w:vAlign w:val="top"/>
+          </w:tcPr>
+          <w:p>
+            <w:pPr>
+              <w:rPr/>
+            </w:pPr>
+            <w:r>
+              <w:rPr>
+                <w:rtl w:val="0"/>
+              </w:rPr>
+              <w:t xml:space="preserve">El cliente</w:t>
+            </w:r>
+          </w:p>
+        </w:tc>
+        <w:tc>
+          <w:tcPr>
+            <w:tcBorders>
+              <w:top w:color="000000" w:space="0" w:sz="8" w:val="single"/>
+              <w:left w:color="000000" w:space="0" w:sz="8" w:val="single"/>
+              <w:bottom w:color="000000" w:space="0" w:sz="8" w:val="single"/>
+              <w:right w:color="000000" w:space="0" w:sz="8" w:val="single"/>
+            </w:tcBorders>
+            <w:tcMar>
+              <w:top w:w="100.0" w:type="dxa"/>
+              <w:left w:w="100.0" w:type="dxa"/>
+              <w:bottom w:w="100.0" w:type="dxa"/>
+              <w:right w:w="100.0" w:type="dxa"/>
+            </w:tcMar>
+            <w:vAlign w:val="top"/>
+          </w:tcPr>
+          <w:p>
+            <w:pPr>
+              <w:rPr/>
+            </w:pPr>
+            <w:r>
+              <w:rPr>
+                <w:rtl w:val="0"/>
+              </w:rPr>
+              <w:t xml:space="preserve">Webpay Plus y Mercado Pago, con la transferencia disponible. Pago total, 50% y 50%.</w:t>
+            </w:r>
+          </w:p>
+        </w:tc>
+        <w:tc>
+          <w:tcPr>
+            <w:tcBorders>
+              <w:top w:color="000000" w:space="0" w:sz="8" w:val="single"/>
+              <w:left w:color="000000" w:space="0" w:sz="8" w:val="single"/>
+              <w:bottom w:color="000000" w:space="0" w:sz="8" w:val="single"/>
+              <w:right w:color="000000" w:space="0" w:sz="8" w:val="single"/>
+            </w:tcBorders>
+            <w:tcMar>
+              <w:top w:w="100.0" w:type="dxa"/>
+              <w:left w:w="100.0" w:type="dxa"/>
+              <w:bottom w:w="100.0" w:type="dxa"/>
+              <w:right w:w="100.0" w:type="dxa"/>
+            </w:tcMar>
+            <w:vAlign w:val="top"/>
+          </w:tcPr>
+          <w:p>
+            <w:pPr>
+              <w:rPr/>
+            </w:pPr>
+            <w:r>
+              <w:rPr>
+                <w:rtl w:val="0"/>
+              </w:rPr>
+              <w:t xml:space="preserve">Generación del documento. En el pago total, el servicio queda activo al confirmarse en el 50/50, el segundo abono se cobra al habilitarse la firma</w:t>
+            </w:r>
+          </w:p>
+        </w:tc>
+      </w:tr>
+      <w:tr>
+        <w:trPr>
+          <w:cantSplit w:val="0"/>
+          <w:trHeight w:val="1055" w:hRule="atLeast"/>
+          <w:tblHeader w:val="0"/>
+        </w:trPr>
+        <w:tc>
+          <w:tcPr>
+            <w:tcBorders>
+              <w:top w:color="000000" w:space="0" w:sz="8" w:val="single"/>
+              <w:left w:color="000000" w:space="0" w:sz="8" w:val="single"/>
+              <w:bottom w:color="000000" w:space="0" w:sz="8" w:val="single"/>
+              <w:right w:color="000000" w:space="0" w:sz="8" w:val="single"/>
+            </w:tcBorders>
+            <w:tcMar>
+              <w:top w:w="100.0" w:type="dxa"/>
+              <w:left w:w="100.0" w:type="dxa"/>
+              <w:bottom w:w="100.0" w:type="dxa"/>
+              <w:right w:w="100.0" w:type="dxa"/>
+            </w:tcMar>
+            <w:vAlign w:val="top"/>
+          </w:tcPr>
+          <w:p>
+            <w:pPr>
+              <w:rPr>
+                <w:b w:val="1"/>
+                <w:bCs w:val="1"/>
+              </w:rPr>
+            </w:pPr>
+            <w:r>
+              <w:rPr>
+                <w:b w:val="1"/>
+                <w:bCs w:val="1"/>
+                <w:rtl w:val="0"/>
+              </w:rPr>
+              <w:t xml:space="preserve">FirmaVirtual (Chile)</w:t>
+            </w:r>
+          </w:p>
+        </w:tc>
+        <w:tc>
+          <w:tcPr>
+            <w:tcBorders>
+              <w:top w:color="000000" w:space="0" w:sz="8" w:val="single"/>
+              <w:left w:color="000000" w:space="0" w:sz="8" w:val="single"/>
+              <w:bottom w:color="000000" w:space="0" w:sz="8" w:val="single"/>
+              <w:right w:color="000000" w:space="0" w:sz="8" w:val="single"/>
+            </w:tcBorders>
+            <w:tcMar>
+              <w:top w:w="100.0" w:type="dxa"/>
+              <w:left w:w="100.0" w:type="dxa"/>
+              <w:bottom w:w="100.0" w:type="dxa"/>
+              <w:right w:w="100.0" w:type="dxa"/>
+            </w:tcMar>
+            <w:vAlign w:val="top"/>
+          </w:tcPr>
+          <w:p>
+            <w:pPr>
+              <w:rPr/>
+            </w:pPr>
+            <w:r>
+              <w:rPr>
+                <w:rtl w:val="0"/>
+              </w:rPr>
+              <w:t xml:space="preserve">Antes de firmar</w:t>
+            </w:r>
+          </w:p>
+        </w:tc>
+        <w:tc>
+          <w:tcPr>
+            <w:tcBorders>
+              <w:top w:color="000000" w:space="0" w:sz="8" w:val="single"/>
+              <w:left w:color="000000" w:space="0" w:sz="8" w:val="single"/>
+              <w:bottom w:color="000000" w:space="0" w:sz="8" w:val="single"/>
+              <w:right w:color="000000" w:space="0" w:sz="8" w:val="single"/>
+            </w:tcBorders>
+            <w:tcMar>
+              <w:top w:w="100.0" w:type="dxa"/>
+              <w:left w:w="100.0" w:type="dxa"/>
+              <w:bottom w:w="100.0" w:type="dxa"/>
+              <w:right w:w="100.0" w:type="dxa"/>
+            </w:tcMar>
+            <w:vAlign w:val="top"/>
+          </w:tcPr>
+          <w:p>
+            <w:pPr>
+              <w:rPr/>
+            </w:pPr>
+            <w:r>
+              <w:rPr>
+                <w:rtl w:val="0"/>
+              </w:rPr>
+              <w:t xml:space="preserve">Los firmantes</w:t>
+            </w:r>
+          </w:p>
+        </w:tc>
+        <w:tc>
+          <w:tcPr>
+            <w:tcBorders>
+              <w:top w:color="000000" w:space="0" w:sz="8" w:val="single"/>
+              <w:left w:color="000000" w:space="0" w:sz="8" w:val="single"/>
+              <w:bottom w:color="000000" w:space="0" w:sz="8" w:val="single"/>
+              <w:right w:color="000000" w:space="0" w:sz="8" w:val="single"/>
+            </w:tcBorders>
+            <w:tcMar>
+              <w:top w:w="100.0" w:type="dxa"/>
+              <w:left w:w="100.0" w:type="dxa"/>
+              <w:bottom w:w="100.0" w:type="dxa"/>
+              <w:right w:w="100.0" w:type="dxa"/>
+            </w:tcMar>
+            <w:vAlign w:val="top"/>
+          </w:tcPr>
+          <w:p>
+            <w:pPr>
+              <w:rPr/>
+            </w:pPr>
+            <w:r>
+              <w:rPr>
+                <w:rtl w:val="0"/>
+              </w:rPr>
+              <w:t xml:space="preserve">Precio fijo por documento, hasta 10 firmantes</w:t>
+            </w:r>
+          </w:p>
+        </w:tc>
+        <w:tc>
+          <w:tcPr>
+            <w:tcBorders>
+              <w:top w:color="000000" w:space="0" w:sz="8" w:val="single"/>
+              <w:left w:color="000000" w:space="0" w:sz="8" w:val="single"/>
+              <w:bottom w:color="000000" w:space="0" w:sz="8" w:val="single"/>
+              <w:right w:color="000000" w:space="0" w:sz="8" w:val="single"/>
+            </w:tcBorders>
+            <w:tcMar>
+              <w:top w:w="100.0" w:type="dxa"/>
+              <w:left w:w="100.0" w:type="dxa"/>
+              <w:bottom w:w="100.0" w:type="dxa"/>
+              <w:right w:w="100.0" w:type="dxa"/>
+            </w:tcMar>
+            <w:vAlign w:val="top"/>
+          </w:tcPr>
+          <w:p>
+            <w:pPr>
+              <w:rPr/>
+            </w:pPr>
+            <w:r>
+              <w:rPr>
+                <w:rtl w:val="0"/>
+              </w:rPr>
+              <w:t xml:space="preserve">El flujo de firma y la certificación notarial</w:t>
+            </w:r>
+          </w:p>
+        </w:tc>
+      </w:tr>
+      <w:tr>
+        <w:trPr>
+          <w:cantSplit w:val="0"/>
+          <w:trHeight w:val="1610" w:hRule="atLeast"/>
+          <w:tblHeader w:val="0"/>
+        </w:trPr>
+        <w:tc>
+          <w:tcPr>
+            <w:tcBorders>
+              <w:top w:color="000000" w:space="0" w:sz="8" w:val="single"/>
+              <w:left w:color="000000" w:space="0" w:sz="8" w:val="single"/>
+              <w:bottom w:color="000000" w:space="0" w:sz="8" w:val="single"/>
+              <w:right w:color="000000" w:space="0" w:sz="8" w:val="single"/>
+            </w:tcBorders>
+            <w:tcMar>
+              <w:top w:w="100.0" w:type="dxa"/>
+              <w:left w:w="100.0" w:type="dxa"/>
+              <w:bottom w:w="100.0" w:type="dxa"/>
+              <w:right w:w="100.0" w:type="dxa"/>
+            </w:tcMar>
+            <w:vAlign w:val="top"/>
+          </w:tcPr>
+          <w:p>
+            <w:pPr>
+              <w:rPr>
+                <w:b w:val="1"/>
+                <w:bCs w:val="1"/>
+              </w:rPr>
+            </w:pPr>
+            <w:r>
+              <w:rPr>
+                <w:b w:val="1"/>
+                <w:bCs w:val="1"/>
+                <w:rtl w:val="0"/>
+              </w:rPr>
+              <w:t xml:space="preserve">Notaría 16 de Bogotá (Colombia)</w:t>
+            </w:r>
+          </w:p>
+        </w:tc>
+        <w:tc>
+          <w:tcPr>
+            <w:tcBorders>
+              <w:top w:color="000000" w:space="0" w:sz="8" w:val="single"/>
+              <w:left w:color="000000" w:space="0" w:sz="8" w:val="single"/>
+              <w:bottom w:color="000000" w:space="0" w:sz="8" w:val="single"/>
+              <w:right w:color="000000" w:space="0" w:sz="8" w:val="single"/>
+            </w:tcBorders>
+            <w:tcMar>
+              <w:top w:w="100.0" w:type="dxa"/>
+              <w:left w:w="100.0" w:type="dxa"/>
+              <w:bottom w:w="100.0" w:type="dxa"/>
+              <w:right w:w="100.0" w:type="dxa"/>
+            </w:tcMar>
+            <w:vAlign w:val="top"/>
+          </w:tcPr>
+          <w:p>
+            <w:pPr>
+              <w:rPr/>
+            </w:pPr>
+            <w:r>
+              <w:rPr>
+                <w:rtl w:val="0"/>
+              </w:rPr>
+              <w:t xml:space="preserve">Después de elegir el trámite y antes de la firma del notario</w:t>
+            </w:r>
+          </w:p>
+        </w:tc>
+        <w:tc>
+          <w:tcPr>
+            <w:tcBorders>
+              <w:top w:color="000000" w:space="0" w:sz="8" w:val="single"/>
+              <w:left w:color="000000" w:space="0" w:sz="8" w:val="single"/>
+              <w:bottom w:color="000000" w:space="0" w:sz="8" w:val="single"/>
+              <w:right w:color="000000" w:space="0" w:sz="8" w:val="single"/>
+            </w:tcBorders>
+            <w:tcMar>
+              <w:top w:w="100.0" w:type="dxa"/>
+              <w:left w:w="100.0" w:type="dxa"/>
+              <w:bottom w:w="100.0" w:type="dxa"/>
+              <w:right w:w="100.0" w:type="dxa"/>
+            </w:tcMar>
+            <w:vAlign w:val="top"/>
+          </w:tcPr>
+          <w:p>
+            <w:pPr>
+              <w:rPr/>
+            </w:pPr>
+            <w:r>
+              <w:rPr>
+                <w:rtl w:val="0"/>
+              </w:rPr>
+              <w:t xml:space="preserve">El usuario</w:t>
+            </w:r>
+          </w:p>
+        </w:tc>
+        <w:tc>
+          <w:tcPr>
+            <w:tcBorders>
+              <w:top w:color="000000" w:space="0" w:sz="8" w:val="single"/>
+              <w:left w:color="000000" w:space="0" w:sz="8" w:val="single"/>
+              <w:bottom w:color="000000" w:space="0" w:sz="8" w:val="single"/>
+              <w:right w:color="000000" w:space="0" w:sz="8" w:val="single"/>
+            </w:tcBorders>
+            <w:tcMar>
+              <w:top w:w="100.0" w:type="dxa"/>
+              <w:left w:w="100.0" w:type="dxa"/>
+              <w:bottom w:w="100.0" w:type="dxa"/>
+              <w:right w:w="100.0" w:type="dxa"/>
+            </w:tcMar>
+            <w:vAlign w:val="top"/>
+          </w:tcPr>
+          <w:p>
+            <w:pPr>
+              <w:rPr/>
+            </w:pPr>
+            <w:r>
+              <w:rPr>
+                <w:rtl w:val="0"/>
+              </w:rPr>
+              <w:t xml:space="preserve">Link de pago por correo, con tarifas fijadas por decreto</w:t>
+            </w:r>
+          </w:p>
+        </w:tc>
+        <w:tc>
+          <w:tcPr>
+            <w:tcBorders>
+              <w:top w:color="000000" w:space="0" w:sz="8" w:val="single"/>
+              <w:left w:color="000000" w:space="0" w:sz="8" w:val="single"/>
+              <w:bottom w:color="000000" w:space="0" w:sz="8" w:val="single"/>
+              <w:right w:color="000000" w:space="0" w:sz="8" w:val="single"/>
+            </w:tcBorders>
+            <w:tcMar>
+              <w:top w:w="100.0" w:type="dxa"/>
+              <w:left w:w="100.0" w:type="dxa"/>
+              <w:bottom w:w="100.0" w:type="dxa"/>
+              <w:right w:w="100.0" w:type="dxa"/>
+            </w:tcMar>
+            <w:vAlign w:val="top"/>
+          </w:tcPr>
+          <w:p>
+            <w:pPr>
+              <w:rPr/>
+            </w:pPr>
+            <w:r>
+              <w:rPr>
+                <w:rtl w:val="0"/>
+              </w:rPr>
+              <w:t xml:space="preserve">La firma y el sello digital del notario</w:t>
+            </w:r>
+          </w:p>
+        </w:tc>
+      </w:tr>
+      <w:tr>
+        <w:trPr>
+          <w:cantSplit w:val="0"/>
+          <w:trHeight w:val="1340" w:hRule="atLeast"/>
+          <w:tblHeader w:val="0"/>
+        </w:trPr>
+        <w:tc>
+          <w:tcPr>
+            <w:tcBorders>
+              <w:top w:color="000000" w:space="0" w:sz="8" w:val="single"/>
+              <w:left w:color="000000" w:space="0" w:sz="8" w:val="single"/>
+              <w:bottom w:color="000000" w:space="0" w:sz="8" w:val="single"/>
+              <w:right w:color="000000" w:space="0" w:sz="8" w:val="single"/>
+            </w:tcBorders>
+            <w:tcMar>
+              <w:top w:w="100.0" w:type="dxa"/>
+              <w:left w:w="100.0" w:type="dxa"/>
+              <w:bottom w:w="100.0" w:type="dxa"/>
+              <w:right w:w="100.0" w:type="dxa"/>
+            </w:tcMar>
+            <w:vAlign w:val="top"/>
+          </w:tcPr>
+          <w:p>
+            <w:pPr>
+              <w:rPr>
+                <w:b w:val="1"/>
+                <w:bCs w:val="1"/>
+              </w:rPr>
+            </w:pPr>
+            <w:r>
+              <w:rPr>
+                <w:b w:val="1"/>
+                <w:bCs w:val="1"/>
+                <w:rtl w:val="0"/>
+              </w:rPr>
+              <w:t xml:space="preserve">Proof (EE.UU.)</w:t>
+            </w:r>
+          </w:p>
+        </w:tc>
+        <w:tc>
+          <w:tcPr>
+            <w:tcBorders>
+              <w:top w:color="000000" w:space="0" w:sz="8" w:val="single"/>
+              <w:left w:color="000000" w:space="0" w:sz="8" w:val="single"/>
+              <w:bottom w:color="000000" w:space="0" w:sz="8" w:val="single"/>
+              <w:right w:color="000000" w:space="0" w:sz="8" w:val="single"/>
+            </w:tcBorders>
+            <w:tcMar>
+              <w:top w:w="100.0" w:type="dxa"/>
+              <w:left w:w="100.0" w:type="dxa"/>
+              <w:bottom w:w="100.0" w:type="dxa"/>
+              <w:right w:w="100.0" w:type="dxa"/>
+            </w:tcMar>
+            <w:vAlign w:val="top"/>
+          </w:tcPr>
+          <w:p>
+            <w:pPr>
+              <w:rPr/>
+            </w:pPr>
+            <w:r>
+              <w:rPr>
+                <w:rtl w:val="0"/>
+              </w:rPr>
+              <w:t xml:space="preserve">Al final, tras la sesión con el notario</w:t>
+            </w:r>
+          </w:p>
+        </w:tc>
+        <w:tc>
+          <w:tcPr>
+            <w:tcBorders>
+              <w:top w:color="000000" w:space="0" w:sz="8" w:val="single"/>
+              <w:left w:color="000000" w:space="0" w:sz="8" w:val="single"/>
+              <w:bottom w:color="000000" w:space="0" w:sz="8" w:val="single"/>
+              <w:right w:color="000000" w:space="0" w:sz="8" w:val="single"/>
+            </w:tcBorders>
+            <w:tcMar>
+              <w:top w:w="100.0" w:type="dxa"/>
+              <w:left w:w="100.0" w:type="dxa"/>
+              <w:bottom w:w="100.0" w:type="dxa"/>
+              <w:right w:w="100.0" w:type="dxa"/>
+            </w:tcMar>
+            <w:vAlign w:val="top"/>
+          </w:tcPr>
+          <w:p>
+            <w:pPr>
+              <w:rPr/>
+            </w:pPr>
+            <w:r>
+              <w:rPr>
+                <w:rtl w:val="0"/>
+              </w:rPr>
+              <w:t xml:space="preserve">El usuario o la organización que envió el documento</w:t>
+            </w:r>
+          </w:p>
+        </w:tc>
+        <w:tc>
+          <w:tcPr>
+            <w:tcBorders>
+              <w:top w:color="000000" w:space="0" w:sz="8" w:val="single"/>
+              <w:left w:color="000000" w:space="0" w:sz="8" w:val="single"/>
+              <w:bottom w:color="000000" w:space="0" w:sz="8" w:val="single"/>
+              <w:right w:color="000000" w:space="0" w:sz="8" w:val="single"/>
+            </w:tcBorders>
+            <w:tcMar>
+              <w:top w:w="100.0" w:type="dxa"/>
+              <w:left w:w="100.0" w:type="dxa"/>
+              <w:bottom w:w="100.0" w:type="dxa"/>
+              <w:right w:w="100.0" w:type="dxa"/>
+            </w:tcMar>
+            <w:vAlign w:val="top"/>
+          </w:tcPr>
+          <w:p>
+            <w:pPr>
+              <w:rPr/>
+            </w:pPr>
+            <w:r>
+              <w:rPr>
+                <w:rtl w:val="0"/>
+              </w:rPr>
+              <w:t xml:space="preserve">Tarjetas y Google Pay</w:t>
+            </w:r>
+          </w:p>
+        </w:tc>
+        <w:tc>
+          <w:tcPr>
+            <w:tcBorders>
+              <w:top w:color="000000" w:space="0" w:sz="8" w:val="single"/>
+              <w:left w:color="000000" w:space="0" w:sz="8" w:val="single"/>
+              <w:bottom w:color="000000" w:space="0" w:sz="8" w:val="single"/>
+              <w:right w:color="000000" w:space="0" w:sz="8" w:val="single"/>
+            </w:tcBorders>
+            <w:tcMar>
+              <w:top w:w="100.0" w:type="dxa"/>
+              <w:left w:w="100.0" w:type="dxa"/>
+              <w:bottom w:w="100.0" w:type="dxa"/>
+              <w:right w:w="100.0" w:type="dxa"/>
+            </w:tcMar>
+            <w:vAlign w:val="top"/>
+          </w:tcPr>
+          <w:p>
+            <w:pPr>
+              <w:rPr/>
+            </w:pPr>
+            <w:r>
+              <w:rPr>
+                <w:rtl w:val="0"/>
+              </w:rPr>
+              <w:t xml:space="preserve">La entrega del documento</w:t>
+            </w:r>
+          </w:p>
+        </w:tc>
+      </w:tr>
+      <w:tr>
+        <w:trPr>
+          <w:cantSplit w:val="0"/>
+          <w:trHeight w:val="1610" w:hRule="atLeast"/>
+          <w:tblHeader w:val="0"/>
+        </w:trPr>
+        <w:tc>
+          <w:tcPr>
+            <w:tcBorders>
+              <w:top w:color="000000" w:space="0" w:sz="8" w:val="single"/>
+              <w:left w:color="000000" w:space="0" w:sz="8" w:val="single"/>
+              <w:bottom w:color="000000" w:space="0" w:sz="8" w:val="single"/>
+              <w:right w:color="000000" w:space="0" w:sz="8" w:val="single"/>
+            </w:tcBorders>
+            <w:tcMar>
+              <w:top w:w="100.0" w:type="dxa"/>
+              <w:left w:w="100.0" w:type="dxa"/>
+              <w:bottom w:w="100.0" w:type="dxa"/>
+              <w:right w:w="100.0" w:type="dxa"/>
+            </w:tcMar>
+            <w:vAlign w:val="top"/>
+          </w:tcPr>
+          <w:p>
+            <w:pPr>
+              <w:rPr>
+                <w:b w:val="1"/>
+                <w:bCs w:val="1"/>
+              </w:rPr>
+            </w:pPr>
+            <w:r>
+              <w:rPr>
+                <w:b w:val="1"/>
+                <w:bCs w:val="1"/>
+                <w:rtl w:val="0"/>
+              </w:rPr>
+              <w:t xml:space="preserve">e-Notariado (Brasil)</w:t>
+            </w:r>
+          </w:p>
+        </w:tc>
+        <w:tc>
+          <w:tcPr>
+            <w:tcBorders>
+              <w:top w:color="000000" w:space="0" w:sz="8" w:val="single"/>
+              <w:left w:color="000000" w:space="0" w:sz="8" w:val="single"/>
+              <w:bottom w:color="000000" w:space="0" w:sz="8" w:val="single"/>
+              <w:right w:color="000000" w:space="0" w:sz="8" w:val="single"/>
+            </w:tcBorders>
+            <w:tcMar>
+              <w:top w:w="100.0" w:type="dxa"/>
+              <w:left w:w="100.0" w:type="dxa"/>
+              <w:bottom w:w="100.0" w:type="dxa"/>
+              <w:right w:w="100.0" w:type="dxa"/>
+            </w:tcMar>
+            <w:vAlign w:val="top"/>
+          </w:tcPr>
+          <w:p>
+            <w:pPr>
+              <w:rPr/>
+            </w:pPr>
+            <w:r>
+              <w:rPr>
+                <w:rtl w:val="0"/>
+              </w:rPr>
+              <w:t xml:space="preserve">Lo define cada notaría</w:t>
+            </w:r>
+          </w:p>
+        </w:tc>
+        <w:tc>
+          <w:tcPr>
+            <w:tcBorders>
+              <w:top w:color="000000" w:space="0" w:sz="8" w:val="single"/>
+              <w:left w:color="000000" w:space="0" w:sz="8" w:val="single"/>
+              <w:bottom w:color="000000" w:space="0" w:sz="8" w:val="single"/>
+              <w:right w:color="000000" w:space="0" w:sz="8" w:val="single"/>
+            </w:tcBorders>
+            <w:tcMar>
+              <w:top w:w="100.0" w:type="dxa"/>
+              <w:left w:w="100.0" w:type="dxa"/>
+              <w:bottom w:w="100.0" w:type="dxa"/>
+              <w:right w:w="100.0" w:type="dxa"/>
+            </w:tcMar>
+            <w:vAlign w:val="top"/>
+          </w:tcPr>
+          <w:p>
+            <w:pPr>
+              <w:rPr/>
+            </w:pPr>
+            <w:r>
+              <w:rPr>
+                <w:rtl w:val="0"/>
+              </w:rPr>
+              <w:t xml:space="preserve">El usuario</w:t>
+            </w:r>
+          </w:p>
+        </w:tc>
+        <w:tc>
+          <w:tcPr>
+            <w:tcBorders>
+              <w:top w:color="000000" w:space="0" w:sz="8" w:val="single"/>
+              <w:left w:color="000000" w:space="0" w:sz="8" w:val="single"/>
+              <w:bottom w:color="000000" w:space="0" w:sz="8" w:val="single"/>
+              <w:right w:color="000000" w:space="0" w:sz="8" w:val="single"/>
+            </w:tcBorders>
+            <w:tcMar>
+              <w:top w:w="100.0" w:type="dxa"/>
+              <w:left w:w="100.0" w:type="dxa"/>
+              <w:bottom w:w="100.0" w:type="dxa"/>
+              <w:right w:w="100.0" w:type="dxa"/>
+            </w:tcMar>
+            <w:vAlign w:val="top"/>
+          </w:tcPr>
+          <w:p>
+            <w:pPr>
+              <w:rPr/>
+            </w:pPr>
+            <w:r>
+              <w:rPr>
+                <w:rtl w:val="0"/>
+              </w:rPr>
+              <w:t xml:space="preserve">Tarifa fijada por la Corregedoria pago electrónico obligatorio, incluso en cuotas</w:t>
+            </w:r>
+          </w:p>
+        </w:tc>
+        <w:tc>
+          <w:tcPr>
+            <w:tcBorders>
+              <w:top w:color="000000" w:space="0" w:sz="8" w:val="single"/>
+              <w:left w:color="000000" w:space="0" w:sz="8" w:val="single"/>
+              <w:bottom w:color="000000" w:space="0" w:sz="8" w:val="single"/>
+              <w:right w:color="000000" w:space="0" w:sz="8" w:val="single"/>
+            </w:tcBorders>
+            <w:tcMar>
+              <w:top w:w="100.0" w:type="dxa"/>
+              <w:left w:w="100.0" w:type="dxa"/>
+              <w:bottom w:w="100.0" w:type="dxa"/>
+              <w:right w:w="100.0" w:type="dxa"/>
+            </w:tcMar>
+            <w:vAlign w:val="top"/>
+          </w:tcPr>
+          <w:p>
+            <w:pPr>
+              <w:rPr/>
+            </w:pPr>
+            <w:r>
+              <w:rPr>
+                <w:rtl w:val="0"/>
+              </w:rPr>
+              <w:t xml:space="preserve">Depende de la notaría</w:t>
+            </w:r>
+          </w:p>
+        </w:tc>
+      </w:tr>
+    </w:tbl>
     <w:p>
       <w:pPr>
         <w:pStyle w:val="Heading1"/>
@@ -4302,6 +5345,14 @@
     </w:tblPr>
   </w:style>
   <w:style w:type="table" w:styleId="Table2">
+    <w:basedOn w:val="TableNormal"/>
+    <w:tblPr>
+      <w:tblStyleRowBandSize w:val="1"/>
+      <w:tblStyleColBandSize w:val="1"/>
+      <w:tblCellMar/>
+    </w:tblPr>
+  </w:style>
+  <w:style w:type="table" w:styleId="Table3">
     <w:basedOn w:val="TableNormal"/>
     <w:tblPr>
       <w:tblStyleRowBandSize w:val="1"/>

</xml_diff>